<commit_message>
Attach the Giving Evidence source to its citation as a page-2 footnote
The source note sat as a loose paragraph at the very end of the document,
four pages after the £900m / 17.5% figures it supports, so a reader had no
way to connect the two.

Converted it to a real footnote anchored at the end of the citation
paragraph. Same wording and styling (italic, 9pt); it now renders at the
foot of page 2. Removes the stranded paragraph, so the final page no
longer holds a single orphaned line.

The .md source still carries the note as a trailing paragraph — left
as-is for now, so docx and md are knowingly out of sync on this point.

Co-Authored-By: Claude Opus 5 <noreply@anthropic.com>
</commit_message>
<xml_diff>
--- a/docs/overview/Grant-Pathway-Business-Overview-v1_19.docx
+++ b/docs/overview/Grant-Pathway-Business-Overview-v1_19.docx
@@ -394,6 +394,13 @@
         </w:rPr>
         <w:t xml:space="preserve">, against around 4% for charities with incomes above £1 million. Roughly four in five UK charities sit in that smallest bracket.</w:t>
       </w:r>
+      <w:r>
+        <w:rPr>
+          <w:color w:val="1A1A1A"/>
+          <w:vertAlign w:val="superscript"/>
+        </w:rPr>
+        <w:footnoteReference w:id="2"/>
+      </w:r>
     </w:p>
     <w:p>
       <w:pPr>
@@ -1024,20 +1031,6 @@
         <w:t>The ambition is simple: to make the grant application process a little less daunting, a little less time-consuming, and a little fairer — for every charity in the UK that is doing good work and deserves the chance to fund it.</w:t>
       </w:r>
     </w:p>
-    <w:p>
-      <w:pPr>
-        <w:spacing w:before="100" w:after="100"/>
-        <w:jc w:val="both"/>
-      </w:pPr>
-      <w:r>
-        <w:rPr>
-          <w:i/>
-          <w:color w:val="1A1A1A"/>
-          <w:sz w:val="18"/>
-        </w:rPr>
-        <w:t xml:space="preserve">Source: Caroline Fiennes, Gemma Bull and Sarah Sandford, Understanding and Reducing the System Costs of Foundations’ Application Processes, Giving Evidence, 2022, funded by the Law Family Commission on Civil Society. Every figure in the report is stated as a conservative minimum. Available at giving-evidence.com.</w:t>
-      </w:r>
-    </w:p>
     <w:sectPr>
       <w:headerReference w:type="default" r:id="rId10"/>
       <w:footerReference w:type="default" r:id="rId11"/>
@@ -1227,6 +1220,31 @@
       </w:pPr>
       <w:r>
         <w:continuationSeparator/>
+      </w:r>
+    </w:p>
+  </w:footnote>
+  <w:footnote w:id="2">
+    <w:p>
+      <w:pPr>
+        <w:spacing w:before="0" w:after="0" w:line="240" w:lineRule="auto"/>
+        <w:jc w:val="both"/>
+      </w:pPr>
+      <w:r>
+        <w:rPr>
+          <w:i/>
+          <w:color w:val="1A1A1A"/>
+          <w:sz w:val="18"/>
+          <w:vertAlign w:val="superscript"/>
+        </w:rPr>
+        <w:footnoteRef/>
+      </w:r>
+      <w:r>
+        <w:rPr>
+          <w:i/>
+          <w:color w:val="1A1A1A"/>
+          <w:sz w:val="18"/>
+        </w:rPr>
+        <w:t xml:space="preserve"> Source: Caroline Fiennes, Gemma Bull and Sarah Sandford, Understanding and Reducing the System Costs of Foundations’ Application Processes, Giving Evidence, 2022, funded by the Law Family Commission on Civil Society. Every figure in the report is stated as a conservative minimum. Available at giving-evidence.com.</w:t>
       </w:r>
     </w:p>
   </w:footnote>

</xml_diff>